<commit_message>
fixed some little things
</commit_message>
<xml_diff>
--- a/Documentation.docx
+++ b/Documentation.docx
@@ -7202,7 +7202,31 @@
           <w:lang w:eastAsia="fr-FR"/>
           <w14:ligatures w14:val="none"/>
         </w:rPr>
-        <w:t xml:space="preserve">Une amélioration serait de gérer tout cela dans </w:t>
+        <w:t xml:space="preserve">Une amélioration serait de gérer tout cela </w:t>
+      </w:r>
+      <w:r>
+        <w:rPr>
+          <w:rFonts w:ascii="Helvetica" w:eastAsia="Times New Roman" w:hAnsi="Helvetica" w:cs="Menlo"/>
+          <w:color w:val="000000" w:themeColor="text1"/>
+          <w:kern w:val="0"/>
+          <w:sz w:val="18"/>
+          <w:szCs w:val="18"/>
+          <w:lang w:eastAsia="fr-FR"/>
+          <w14:ligatures w14:val="none"/>
+        </w:rPr>
+        <w:t>avec</w:t>
+      </w:r>
+      <w:r>
+        <w:rPr>
+          <w:rFonts w:ascii="Helvetica" w:eastAsia="Times New Roman" w:hAnsi="Helvetica" w:cs="Menlo"/>
+          <w:color w:val="000000" w:themeColor="text1"/>
+          <w:kern w:val="0"/>
+          <w:sz w:val="18"/>
+          <w:szCs w:val="18"/>
+          <w:lang w:eastAsia="fr-FR"/>
+          <w14:ligatures w14:val="none"/>
+        </w:rPr>
+        <w:t xml:space="preserve"> </w:t>
       </w:r>
       <w:proofErr w:type="spellStart"/>
       <w:r>
@@ -7228,7 +7252,7 @@
           <w:lang w:eastAsia="fr-FR"/>
           <w14:ligatures w14:val="none"/>
         </w:rPr>
-        <w:t>.</w:t>
+        <w:t>, dans l’interface utilisateur.</w:t>
       </w:r>
     </w:p>
     <w:p>
@@ -9044,6 +9068,8 @@
   </w:compat>
   <w:rsids>
     <w:rsidRoot w:val="00CD3567"/>
+    <w:rsid w:val="00127262"/>
+    <w:rsid w:val="0069513E"/>
     <w:rsid w:val="007A6CE1"/>
     <w:rsid w:val="00B84C3B"/>
     <w:rsid w:val="00CD3567"/>

</xml_diff>